<commit_message>
CyberResilient value case: add cases 8 (assurance) and 9 (internal GTM)
Resolve the 7-vs-9 mismatch with the Blueprint chart: add Case 8
Assurance/attestation (a customer-facing output of the Case 2 reconcile,
packaged as a verifiable badge; insurance wedge) and Case 9 Internal GTM
intelligence (a different bucket — the engine pointed at CyberResilient's
own funnel, not a customer feature). Value case and chart now both show
9: eight customer-facing plus one internal. Word doc regenerated to match.

Co-Authored-By: Claude Opus 4.8 <noreply@anthropic.com>
Claude-Session: https://claude.ai/code/session_01Mo4Fs4TDt8iSRSXUgtpYvc
</commit_message>
<xml_diff>
--- a/presales_scout/docs/cyberresilient/cyberresilient_value_case.docx
+++ b/presales_scout/docs/cyberresilient/cyberresilient_value_case.docx
@@ -630,6 +630,78 @@
           <w:szCs w:val="19"/>
         </w:rPr>
         <w:t xml:space="preserve">e.g. 8 of 10 Swedish energy/transport operators run unenforced DMARC — a sector-level finding.</w:t>
+      </w:r>
+    </w:p>
+    <w:p>
+      <w:pPr>
+        <w:pStyle w:val="Heading2"/>
+        <w:spacing w:after="90" w:before="200"/>
+      </w:pPr>
+      <w:r>
+        <w:t xml:space="preserve">8 · Assurance / attestation (new line · output of Case 2)</w:t>
+      </w:r>
+    </w:p>
+    <w:p>
+      <w:pPr>
+        <w:spacing w:after="120"/>
+      </w:pPr>
+      <w:r>
+        <w:rPr>
+          <w:sz w:val="21"/>
+          <w:szCs w:val="21"/>
+        </w:rPr>
+        <w:t xml:space="preserve">A customer at a maturity level whose observed posture checks out earns a verifiable “resilience verified” attestation — evidence-backed, not self-declared. Same observed-vs-self-report check as Case 2, packaged as a badge they show third parties: partners, insurers, procurement.</w:t>
+      </w:r>
+    </w:p>
+    <w:p>
+      <w:pPr>
+        <w:spacing w:after="120"/>
+      </w:pPr>
+      <w:r>
+        <w:rPr>
+          <w:i/>
+          <w:iCs/>
+          <w:color w:val="3A3F96"/>
+          <w:sz w:val="19"/>
+          <w:szCs w:val="19"/>
+        </w:rPr>
+        <w:t xml:space="preserve">A monetizable output and a wedge into cyber-insurance underwriting — insurers want exactly this objective signal.</w:t>
+      </w:r>
+    </w:p>
+    <w:p>
+      <w:pPr>
+        <w:pStyle w:val="Heading2"/>
+        <w:spacing w:after="90" w:before="200"/>
+      </w:pPr>
+      <w:r>
+        <w:t xml:space="preserve">9 · Internal GTM intelligence (different bucket · internal)</w:t>
+      </w:r>
+    </w:p>
+    <w:p>
+      <w:pPr>
+        <w:spacing w:after="120"/>
+      </w:pPr>
+      <w:r>
+        <w:rPr>
+          <w:sz w:val="21"/>
+          <w:szCs w:val="21"/>
+        </w:rPr>
+        <w:t xml:space="preserve">Not a customer feature — point the same engine at your own funnel. UpliftIQ scores which trials convert, which customers are expansion-ready, which are churn risks: decision optimization applied to your business.</w:t>
+      </w:r>
+    </w:p>
+    <w:p>
+      <w:pPr>
+        <w:spacing w:after="120"/>
+      </w:pPr>
+      <w:r>
+        <w:rPr>
+          <w:i/>
+          <w:iCs/>
+          <w:color w:val="3A3F96"/>
+          <w:sz w:val="19"/>
+          <w:szCs w:val="19"/>
+        </w:rPr>
+        <w:t xml:space="preserve">Cases 1–8 are what you sell; this is how you run. Same engine, pointed inward.</w:t>
       </w:r>
     </w:p>
     <w:p>

</xml_diff>